<commit_message>
Fix Week 2 visualization audit and improve reproducibility
</commit_message>
<xml_diff>
--- a/report/Week2_Data_Visualization_Report.docx
+++ b/report/Week2_Data_Visualization_Report.docx
@@ -332,7 +332,7 @@
           <w:color w:val="212529"/>
           <w:sz w:val="22"/>
         </w:rPr>
-        <w:t xml:space="preserve">  16.   Line Chart Design Decision</w:t>
+        <w:t xml:space="preserve">  16.   Figure 13 — Life-Cycle Age Cohort Trend &amp; Line Chart Decision</w:t>
       </w:r>
     </w:p>
     <w:p>
@@ -345,7 +345,7 @@
           <w:color w:val="212529"/>
           <w:sz w:val="22"/>
         </w:rPr>
-        <w:t xml:space="preserve">  17.   Evidence-Based Insights (11 Findings)</w:t>
+        <w:t xml:space="preserve">  17.   Supplementary Visualization 14 — Lattice Trellis Plot (Age vs Hours by Income)</w:t>
       </w:r>
     </w:p>
     <w:p>
@@ -358,7 +358,7 @@
           <w:color w:val="212529"/>
           <w:sz w:val="22"/>
         </w:rPr>
-        <w:t xml:space="preserve">  18.   Non-Technical Communication Summary</w:t>
+        <w:t xml:space="preserve">  18.   Supplementary Visualization 15 — Base R Graphics (Age Distribution Histogram)</w:t>
       </w:r>
     </w:p>
     <w:p>
@@ -371,7 +371,7 @@
           <w:color w:val="212529"/>
           <w:sz w:val="22"/>
         </w:rPr>
-        <w:t xml:space="preserve">  19.   Limitations</w:t>
+        <w:t xml:space="preserve">  19.   Evidence-Based Insights (11 Findings)</w:t>
       </w:r>
     </w:p>
     <w:p>
@@ -384,7 +384,7 @@
           <w:color w:val="212529"/>
           <w:sz w:val="22"/>
         </w:rPr>
-        <w:t xml:space="preserve">  20.   Conclusion</w:t>
+        <w:t xml:space="preserve">  20.   Non-Technical Communication Summary</w:t>
       </w:r>
     </w:p>
     <w:p>
@@ -397,7 +397,33 @@
           <w:color w:val="212529"/>
           <w:sz w:val="22"/>
         </w:rPr>
-        <w:t xml:space="preserve">  21.   References</w:t>
+        <w:t xml:space="preserve">  21.   Limitations</w:t>
+      </w:r>
+    </w:p>
+    <w:p>
+      <w:pPr>
+        <w:spacing w:after="40"/>
+      </w:pPr>
+      <w:r>
+        <w:rPr>
+          <w:rFonts w:ascii="Calibri" w:hAnsi="Calibri"/>
+          <w:color w:val="212529"/>
+          <w:sz w:val="22"/>
+        </w:rPr>
+        <w:t xml:space="preserve">  22.   Conclusion</w:t>
+      </w:r>
+    </w:p>
+    <w:p>
+      <w:pPr>
+        <w:spacing w:after="40"/>
+      </w:pPr>
+      <w:r>
+        <w:rPr>
+          <w:rFonts w:ascii="Calibri" w:hAnsi="Calibri"/>
+          <w:color w:val="212529"/>
+          <w:sz w:val="22"/>
+        </w:rPr>
+        <w:t xml:space="preserve">  23.   References</w:t>
       </w:r>
     </w:p>
     <w:p>
@@ -1617,7 +1643,7 @@
                 <w:color w:val="212529"/>
                 <w:sz w:val="20"/>
               </w:rPr>
-              <w:t>Bar Chart</w:t>
+              <w:t>Bar Chart (ggplot2)</w:t>
             </w:r>
           </w:p>
         </w:tc>
@@ -1666,7 +1692,7 @@
                 <w:color w:val="212529"/>
                 <w:sz w:val="20"/>
               </w:rPr>
-              <w:t>Histogram</w:t>
+              <w:t>Histogram (ggplot2)</w:t>
             </w:r>
           </w:p>
         </w:tc>
@@ -1714,7 +1740,7 @@
                 <w:color w:val="212529"/>
                 <w:sz w:val="20"/>
               </w:rPr>
-              <w:t>Violin + Boxplot</w:t>
+              <w:t>Violin + Boxplot (ggplot2)</w:t>
             </w:r>
           </w:p>
         </w:tc>
@@ -1763,7 +1789,7 @@
                 <w:color w:val="212529"/>
                 <w:sz w:val="20"/>
               </w:rPr>
-              <w:t>Scatter Plot</w:t>
+              <w:t>Scatter Plot (ggplot2)</w:t>
             </w:r>
           </w:p>
         </w:tc>
@@ -1811,7 +1837,7 @@
                 <w:color w:val="212529"/>
                 <w:sz w:val="20"/>
               </w:rPr>
-              <w:t>Proportional Stacked Bar</w:t>
+              <w:t>Proportional Stacked Bar (ggplot2)</w:t>
             </w:r>
           </w:p>
         </w:tc>
@@ -1860,7 +1886,7 @@
                 <w:color w:val="212529"/>
                 <w:sz w:val="20"/>
               </w:rPr>
-              <w:t>Heatmap (Correlation)</w:t>
+              <w:t>Heatmap (ggplot2 / reshape2)</w:t>
             </w:r>
           </w:p>
         </w:tc>
@@ -1908,7 +1934,7 @@
                 <w:color w:val="212529"/>
                 <w:sz w:val="20"/>
               </w:rPr>
-              <w:t>Ordered Cohort Line</w:t>
+              <w:t>Ordered Cohort Line (ggplot2)</w:t>
             </w:r>
           </w:p>
         </w:tc>
@@ -1941,6 +1967,103 @@
                 <w:sz w:val="20"/>
               </w:rPr>
               <w:t>Age cohort income rate (Figure 13)</w:t>
+            </w:r>
+          </w:p>
+        </w:tc>
+      </w:tr>
+      <w:tr>
+        <w:tc>
+          <w:tcPr>
+            <w:tcW w:type="dxa" w:w="3024"/>
+          </w:tcPr>
+          <w:p>
+            <w:r>
+              <w:rPr>
+                <w:rFonts w:ascii="Calibri" w:hAnsi="Calibri"/>
+                <w:color w:val="212529"/>
+                <w:sz w:val="20"/>
+              </w:rPr>
+              <w:t>Trellis Conditioning Plot (lattice)</w:t>
+            </w:r>
+          </w:p>
+        </w:tc>
+        <w:tc>
+          <w:tcPr>
+            <w:tcW w:type="dxa" w:w="3024"/>
+          </w:tcPr>
+          <w:p>
+            <w:r>
+              <w:rPr>
+                <w:rFonts w:ascii="Calibri" w:hAnsi="Calibri"/>
+                <w:color w:val="212529"/>
+                <w:sz w:val="20"/>
+              </w:rPr>
+              <w:t>Multipanel conditional bivariate distributions</w:t>
+            </w:r>
+          </w:p>
+        </w:tc>
+        <w:tc>
+          <w:tcPr>
+            <w:tcW w:type="dxa" w:w="3024"/>
+          </w:tcPr>
+          <w:p>
+            <w:r>
+              <w:rPr>
+                <w:rFonts w:ascii="Calibri" w:hAnsi="Calibri"/>
+                <w:color w:val="212529"/>
+                <w:sz w:val="20"/>
+              </w:rPr>
+              <w:t>Age vs Hours stratified by Income (Figure 14)</w:t>
+            </w:r>
+          </w:p>
+        </w:tc>
+      </w:tr>
+      <w:tr>
+        <w:tc>
+          <w:tcPr>
+            <w:tcW w:type="dxa" w:w="3024"/>
+            <w:shd w:fill="F8F9FA"/>
+          </w:tcPr>
+          <w:p>
+            <w:r>
+              <w:rPr>
+                <w:rFonts w:ascii="Calibri" w:hAnsi="Calibri"/>
+                <w:color w:val="212529"/>
+                <w:sz w:val="20"/>
+              </w:rPr>
+              <w:t>Histogram (Base R)</w:t>
+            </w:r>
+          </w:p>
+        </w:tc>
+        <w:tc>
+          <w:tcPr>
+            <w:tcW w:type="dxa" w:w="3024"/>
+            <w:shd w:fill="F8F9FA"/>
+          </w:tcPr>
+          <w:p>
+            <w:r>
+              <w:rPr>
+                <w:rFonts w:ascii="Calibri" w:hAnsi="Calibri"/>
+                <w:color w:val="212529"/>
+                <w:sz w:val="20"/>
+              </w:rPr>
+              <w:t>Dependency-free continuous distribution audit</w:t>
+            </w:r>
+          </w:p>
+        </w:tc>
+        <w:tc>
+          <w:tcPr>
+            <w:tcW w:type="dxa" w:w="3024"/>
+            <w:shd w:fill="F8F9FA"/>
+          </w:tcPr>
+          <w:p>
+            <w:r>
+              <w:rPr>
+                <w:rFonts w:ascii="Calibri" w:hAnsi="Calibri"/>
+                <w:color w:val="212529"/>
+                <w:sz w:val="20"/>
+              </w:rPr>
+              <w:t>Age distribution histogram (Figure 15)</w:t>
             </w:r>
           </w:p>
         </w:tc>
@@ -5731,7 +5854,7 @@
           <w:color w:val="1B365D"/>
           <w:sz w:val="36"/>
         </w:rPr>
-        <w:t>Line Chart Design Decision</w:t>
+        <w:t>Line Chart Design Decision &amp; Figure 13</w:t>
       </w:r>
     </w:p>
     <w:p>
@@ -5780,7 +5903,7 @@
                 <w:color w:val="465C7A"/>
                 <w:sz w:val="21"/>
               </w:rPr>
-              <w:t>DESIGN DECISION: A conventional time-series line chart was NOT produced in this report because the UCI Adult Dataset (1994 U.S. Census CPS) is a single-wave cross-sectional survey. It contains NO temporal variable — no year, month, date, or time-series identifier is present in any of the 15 variables. Drawing a line chart along an arbitrary or fabricated time axis would produce a misleading visualization that implies temporal change when no time dimension exists in the data.</w:t>
+              <w:t>DESIGN DECISION: A conventional time-series line chart was NOT produced in this report because the UCI Adult Dataset (1994 U.S. Census CPS) is a single-wave cross-sectional survey. It contains NO temporal variable — no year, month, date, or time-series identifier is present in any of the 15 variables. Drawing a line chart along an arbitrary or fabricated time axis would produce a misleading visualization that implies temporal change when no time dimension exists in the data. This is an ordered cross-sectional cohort comparison, not a longitudinal time-series chart.</w:t>
             </w:r>
           </w:p>
         </w:tc>
@@ -5797,7 +5920,7 @@
           <w:color w:val="212529"/>
           <w:sz w:val="22"/>
         </w:rPr>
-        <w:t>However, an analytically justified ordered-category trend visualization was produced as Figure 13 (Supplementary: Age Cohort Income Trend). This uses synthetic cross-sectional age brackets (17–25, 26–35, 36–45, 46–55, 56–65, 66+) as an ordered categorical X-axis, connected by a line to show the trend across life-cycle stages. This is clearly labelled as a COHORT COMPARISON across age brackets, not a longitudinal time series.</w:t>
+        <w:t>However, an analytically justified ordered-category trend visualization was produced as Figure 13 (Supplementary: Age Cohort Income Trend). This uses synthetic cross-sectional age brackets (17–25, 26–35, 36–45, 46–55, 56–65, 66+) as an ordered categorical X-axis, connected by a line to show the pattern across life-cycle stages. This is clearly labelled as an ordered cross-sectional cohort comparison across age brackets, not a longitudinal time series.</w:t>
       </w:r>
     </w:p>
     <w:p>
@@ -5856,6 +5979,22 @@
     </w:p>
     <w:p>
       <w:pPr>
+        <w:pStyle w:val="Heading2"/>
+        <w:keepNext/>
+        <w:spacing w:before="200" w:after="80"/>
+      </w:pPr>
+      <w:r>
+        <w:rPr>
+          <w:rFonts w:ascii="Calibri" w:hAnsi="Calibri"/>
+          <w:b/>
+          <w:color w:val="465C7A"/>
+          <w:sz w:val="28"/>
+        </w:rPr>
+        <w:t>Interpretation &amp; Cohort Dynamics</w:t>
+      </w:r>
+    </w:p>
+    <w:p>
+      <w:pPr>
         <w:spacing w:after="120" w:line="276" w:lineRule="auto"/>
       </w:pPr>
       <w:r>
@@ -5864,9 +6003,702 @@
           <w:color w:val="212529"/>
           <w:sz w:val="22"/>
         </w:rPr>
-        <w:t>Figure 13 reveals an inverted U-curve: the proportion of high-income earners rises from 10.4% in the youngest cohort (17–25) to peak at 40.0% in the 46–55 bracket, then declines to 21.9% in the 66+ cohort as retirees return to part-time or reduced-income arrangements. This pattern is consistent with career lifecycle theory, though the cross-sectional design cannot separate age effects from cohort or period effects.</w:t>
+        <w:t>Figure 13 illustrates an inverted U-curve across ordered age cohorts: The proportion of individuals in the &gt;50K income group rises from approximately 1.8% in the 17–25 age cohort (1.78%, N=6,400) to approximately 18.7% in the 26–35 cohort (18.70%, N=8,510), and approximately 34.6% in the 36–45 cohort (34.63%, N=8,005), reaching a peak of approximately 39.9% (39.86%, N=5,534) among individuals aged 46–55. It then declines to approximately 31.5% (31.49%, N=2,931) in the 56–65 cohort, and to approximately 20.1% (20.14%, N=1,157) in the 66+ cohort.</w:t>
       </w:r>
     </w:p>
+    <w:p>
+      <w:pPr>
+        <w:spacing w:after="120" w:line="276" w:lineRule="auto"/>
+      </w:pPr>
+      <w:r>
+        <w:rPr>
+          <w:rFonts w:ascii="Calibri" w:hAnsi="Calibri"/>
+          <w:color w:val="212529"/>
+          <w:sz w:val="22"/>
+        </w:rPr>
+        <w:t>Importantly, this cross-sectional pattern may reflect differences in employment status, labor-force participation, cohort composition, educational differences across generations, and other factors, but the dataset cannot establish the cause. It must not be interpreted as longitudinal career earnings trajectories for specific individuals, because the data represents a single-point-in-time cross-section.</w:t>
+      </w:r>
+    </w:p>
+    <w:p>
+      <w:r>
+        <w:br w:type="page"/>
+      </w:r>
+    </w:p>
+    <w:p>
+      <w:pPr>
+        <w:pStyle w:val="Heading1"/>
+        <w:keepNext/>
+        <w:spacing w:before="280" w:after="80"/>
+      </w:pPr>
+      <w:r>
+        <w:rPr>
+          <w:rFonts w:ascii="Calibri" w:hAnsi="Calibri"/>
+          <w:b/>
+          <w:color w:val="1B365D"/>
+          <w:sz w:val="36"/>
+        </w:rPr>
+        <w:t>Supplementary Visualization 14 — Lattice: Age vs Weekly Hours by Income Group</w:t>
+      </w:r>
+    </w:p>
+    <w:p>
+      <w:pPr>
+        <w:pStyle w:val="Heading3"/>
+        <w:keepNext/>
+        <w:spacing w:before="200" w:after="80"/>
+      </w:pPr>
+      <w:r>
+        <w:rPr>
+          <w:rFonts w:ascii="Calibri" w:hAnsi="Calibri"/>
+          <w:b/>
+          <w:color w:val="465C7A"/>
+          <w:sz w:val="24"/>
+        </w:rPr>
+        <w:t>Purpose</w:t>
+      </w:r>
+    </w:p>
+    <w:p>
+      <w:pPr>
+        <w:spacing w:after="120" w:line="276" w:lineRule="auto"/>
+      </w:pPr>
+      <w:r>
+        <w:rPr>
+          <w:rFonts w:ascii="Calibri" w:hAnsi="Calibri"/>
+          <w:color w:val="212529"/>
+          <w:sz w:val="22"/>
+        </w:rPr>
+        <w:t>To explore and compare the bivariate relationship between worker age and weekly working hours conditionally stratified across income groups (&lt;=50K and &gt;50K) using the Trellis multipanel graphics paradigm implemented in the lattice package.</w:t>
+      </w:r>
+    </w:p>
+    <w:p>
+      <w:pPr>
+        <w:pStyle w:val="Heading3"/>
+        <w:keepNext/>
+        <w:spacing w:before="200" w:after="80"/>
+      </w:pPr>
+      <w:r>
+        <w:rPr>
+          <w:rFonts w:ascii="Calibri" w:hAnsi="Calibri"/>
+          <w:b/>
+          <w:color w:val="465C7A"/>
+          <w:sz w:val="24"/>
+        </w:rPr>
+        <w:t>Why This Chart Was Selected</w:t>
+      </w:r>
+    </w:p>
+    <w:p>
+      <w:pPr>
+        <w:spacing w:after="120" w:line="276" w:lineRule="auto"/>
+      </w:pPr>
+      <w:r>
+        <w:rPr>
+          <w:rFonts w:ascii="Calibri" w:hAnsi="Calibri"/>
+          <w:color w:val="212529"/>
+          <w:sz w:val="22"/>
+        </w:rPr>
+        <w:t>The assignment specifically calls for exploring multiple R visualization frameworks, including lattice alongside ggplot2. The lattice package (Sarkar, 2008) is R's canonical implementation of Trellis display methodology (Cleveland, 1993). While ggplot2 excels at layered grammar, lattice provides an exceptionally clean, high-performance formula-based syntax (hours_per_week ~ age | income) for conditioned multipanel plots. Separating the income groups into distinct conditioned panels eliminates the visual occlusion that occurs when 32,537 points are plotted together on a single set of axes, allowing side-by-side comparison of fitted regression trajectories.</w:t>
+      </w:r>
+    </w:p>
+    <w:p>
+      <w:pPr>
+        <w:pStyle w:val="Heading3"/>
+        <w:keepNext/>
+        <w:spacing w:before="200" w:after="80"/>
+      </w:pPr>
+      <w:r>
+        <w:rPr>
+          <w:rFonts w:ascii="Calibri" w:hAnsi="Calibri"/>
+          <w:b/>
+          <w:color w:val="465C7A"/>
+          <w:sz w:val="24"/>
+        </w:rPr>
+        <w:t>R Code</w:t>
+      </w:r>
+    </w:p>
+    <w:tbl>
+      <w:tblPr>
+        <w:tblW w:type="auto" w:w="0"/>
+        <w:jc w:val="left"/>
+        <w:tblLayout w:type="fixed"/>
+        <w:tblLook w:firstColumn="1" w:firstRow="1" w:lastColumn="0" w:lastRow="0" w:noHBand="0" w:noVBand="1" w:val="04A0"/>
+      </w:tblPr>
+      <w:tblGrid>
+        <w:gridCol w:w="9072"/>
+      </w:tblGrid>
+      <w:tr>
+        <w:tc>
+          <w:tcPr>
+            <w:tcW w:type="dxa" w:w="9360"/>
+            <w:shd w:fill="1E1E2E"/>
+            <w:tcMar>
+              <w:top w:w="150" w:type="dxa"/>
+              <w:bottom w:w="150" w:type="dxa"/>
+              <w:left w:w="200" w:type="dxa"/>
+              <w:right w:w="200" w:type="dxa"/>
+            </w:tcMar>
+          </w:tcPr>
+          <w:p>
+            <w:r>
+              <w:rPr>
+                <w:rFonts w:ascii="Consolas" w:hAnsi="Consolas"/>
+                <w:color w:val="CDD6F4"/>
+                <w:sz w:val="17"/>
+              </w:rPr>
+              <w:t>library(lattice)</w:t>
+              <w:br/>
+              <w:br/>
+              <w:t>png("plots/week2_14_lattice_age_hours_income.png", width = 2700, height = 1800, res = 300)</w:t>
+              <w:br/>
+              <w:t>lattice_theme &lt;- list(</w:t>
+              <w:br/>
+              <w:t xml:space="preserve">  strip.background = list(col = "#1B365D"),</w:t>
+              <w:br/>
+              <w:t xml:space="preserve">  strip.text = list(col = "white", font = 2, cex = 1.05),</w:t>
+              <w:br/>
+              <w:t xml:space="preserve">  axis.line = list(col = "#6C757D"),</w:t>
+              <w:br/>
+              <w:t xml:space="preserve">  axis.text = list(cex = 0.9, col = "#212529")</w:t>
+              <w:br/>
+              <w:t>)</w:t>
+              <w:br/>
+              <w:br/>
+              <w:t>p14_lattice &lt;- xyplot(</w:t>
+              <w:br/>
+              <w:t xml:space="preserve">  hours_per_week ~ age | income,</w:t>
+              <w:br/>
+              <w:t xml:space="preserve">  data = adult,</w:t>
+              <w:br/>
+              <w:t xml:space="preserve">  par.settings = lattice_theme,</w:t>
+              <w:br/>
+              <w:t xml:space="preserve">  pch = 16, cex = 0.55, alpha = 0.22, col = "#4A90E2",</w:t>
+              <w:br/>
+              <w:t xml:space="preserve">  grid = TRUE, type = c("p", "r"), lwd = 2.5, col.line = "#D9534F",</w:t>
+              <w:br/>
+              <w:t xml:space="preserve">  xlab = list("Age (Years)", font = 2, cex = 1.05),</w:t>
+              <w:br/>
+              <w:t xml:space="preserve">  ylab = list("Hours Worked per Week", font = 2, cex = 1.05),</w:t>
+              <w:br/>
+              <w:t xml:space="preserve">  main = list("Figure 14. Weekly Hours vs Age Stratified by Income (Lattice Trellis)",</w:t>
+              <w:br/>
+              <w:t xml:space="preserve">              font = 2, cex = 1.15, col = "#1B365D"),</w:t>
+              <w:br/>
+              <w:t xml:space="preserve">  sub = list("Conditioned multi-panel display: Linear fit across &lt;=50K (left) and &gt;50K (right)",</w:t>
+              <w:br/>
+              <w:t xml:space="preserve">             font = 1, cex = 0.85, col = "#465C7A"),</w:t>
+              <w:br/>
+              <w:t xml:space="preserve">  layout = c(2, 1)</w:t>
+              <w:br/>
+              <w:t>)</w:t>
+              <w:br/>
+              <w:t>print(p14_lattice)</w:t>
+              <w:br/>
+              <w:t>dev.off()</w:t>
+            </w:r>
+          </w:p>
+        </w:tc>
+      </w:tr>
+    </w:tbl>
+    <w:p/>
+    <w:p>
+      <w:pPr>
+        <w:pStyle w:val="Heading3"/>
+        <w:keepNext/>
+        <w:spacing w:before="200" w:after="80"/>
+      </w:pPr>
+      <w:r>
+        <w:rPr>
+          <w:rFonts w:ascii="Calibri" w:hAnsi="Calibri"/>
+          <w:b/>
+          <w:color w:val="465C7A"/>
+          <w:sz w:val="24"/>
+        </w:rPr>
+        <w:t>Output</w:t>
+      </w:r>
+    </w:p>
+    <w:p>
+      <w:pPr>
+        <w:jc w:val="center"/>
+      </w:pPr>
+      <w:r>
+        <w:drawing>
+          <wp:inline xmlns:a="http://schemas.openxmlformats.org/drawingml/2006/main" xmlns:pic="http://schemas.openxmlformats.org/drawingml/2006/picture">
+            <wp:extent cx="5486400" cy="3657600"/>
+            <wp:docPr id="14" name="Picture 14"/>
+            <wp:cNvGraphicFramePr>
+              <a:graphicFrameLocks noChangeAspect="1"/>
+            </wp:cNvGraphicFramePr>
+            <a:graphic>
+              <a:graphicData uri="http://schemas.openxmlformats.org/drawingml/2006/picture">
+                <pic:pic>
+                  <pic:nvPicPr>
+                    <pic:cNvPr id="0" name="week2_14_lattice_age_hours_income.png"/>
+                    <pic:cNvPicPr/>
+                  </pic:nvPicPr>
+                  <pic:blipFill>
+                    <a:blip r:embed="rId22"/>
+                    <a:stretch>
+                      <a:fillRect/>
+                    </a:stretch>
+                  </pic:blipFill>
+                  <pic:spPr>
+                    <a:xfrm>
+                      <a:off x="0" y="0"/>
+                      <a:ext cx="5486400" cy="3657600"/>
+                    </a:xfrm>
+                    <a:prstGeom prst="rect"/>
+                  </pic:spPr>
+                </pic:pic>
+              </a:graphicData>
+            </a:graphic>
+          </wp:inline>
+        </w:drawing>
+      </w:r>
+    </w:p>
+    <w:p>
+      <w:pPr>
+        <w:spacing w:after="240"/>
+        <w:jc w:val="center"/>
+      </w:pPr>
+      <w:r>
+        <w:rPr>
+          <w:rFonts w:ascii="Calibri" w:hAnsi="Calibri"/>
+          <w:i/>
+          <w:color w:val="6C757D"/>
+          <w:sz w:val="19"/>
+        </w:rPr>
+        <w:t>Figure 14. Supplementary Lattice Plot: Weekly Hours vs Age Stratified by Income Category (lattice::xyplot)</w:t>
+      </w:r>
+    </w:p>
+    <w:p>
+      <w:pPr>
+        <w:pStyle w:val="Heading3"/>
+        <w:keepNext/>
+        <w:spacing w:before="200" w:after="80"/>
+      </w:pPr>
+      <w:r>
+        <w:rPr>
+          <w:rFonts w:ascii="Calibri" w:hAnsi="Calibri"/>
+          <w:b/>
+          <w:color w:val="465C7A"/>
+          <w:sz w:val="24"/>
+        </w:rPr>
+        <w:t>Interpretation</w:t>
+      </w:r>
+    </w:p>
+    <w:p>
+      <w:pPr>
+        <w:spacing w:after="120" w:line="276" w:lineRule="auto"/>
+      </w:pPr>
+      <w:r>
+        <w:rPr>
+          <w:rFonts w:ascii="Calibri" w:hAnsi="Calibri"/>
+          <w:color w:val="212529"/>
+          <w:sz w:val="22"/>
+        </w:rPr>
+        <w:t>The conditioned Trellis panels provide an unobstructed visual comparison of work hours profiles between the two income cohorts across the entire age spectrum. In the left panel (&lt;=50K, N = 24,698), the data is strongly anchored at the 40-hour baseline, but exhibits heavy density in part-time hours (&lt;35 hours) among younger workers under 25 and older workers past 65. The linear regression fit remains relatively flat near 38.8 hours per week. In contrast, the right panel (&gt;50K, N = 7,839) demonstrates virtually no part-time employment; data points are heavily concentrated at 40, 50, and 60 hours per week across all ages, and the fitted regression line sits at approximately 45.5 hours per week across the entire working lifespan from age 28 through age 65.</w:t>
+      </w:r>
+    </w:p>
+    <w:p>
+      <w:pPr>
+        <w:pStyle w:val="Heading3"/>
+        <w:keepNext/>
+        <w:spacing w:before="200" w:after="80"/>
+      </w:pPr>
+      <w:r>
+        <w:rPr>
+          <w:rFonts w:ascii="Calibri" w:hAnsi="Calibri"/>
+          <w:b/>
+          <w:color w:val="465C7A"/>
+          <w:sz w:val="24"/>
+        </w:rPr>
+        <w:t>Key Insight</w:t>
+      </w:r>
+    </w:p>
+    <w:tbl>
+      <w:tblPr>
+        <w:tblW w:type="auto" w:w="0"/>
+        <w:jc w:val="center"/>
+        <w:tblLayout w:type="fixed"/>
+        <w:tblLook w:firstColumn="1" w:firstRow="1" w:lastColumn="0" w:lastRow="0" w:noHBand="0" w:noVBand="1" w:val="04A0"/>
+      </w:tblPr>
+      <w:tblGrid>
+        <w:gridCol w:w="9072"/>
+      </w:tblGrid>
+      <w:tr>
+        <w:tc>
+          <w:tcPr>
+            <w:tcW w:type="dxa" w:w="9360"/>
+            <w:shd w:fill="F0F4F8"/>
+            <w:tcMar>
+              <w:top w:w="120" w:type="dxa"/>
+              <w:bottom w:w="120" w:type="dxa"/>
+              <w:left w:w="180" w:type="dxa"/>
+              <w:right w:w="180" w:type="dxa"/>
+            </w:tcMar>
+          </w:tcPr>
+          <w:p>
+            <w:pPr>
+              <w:spacing w:before="40" w:after="40"/>
+            </w:pPr>
+            <w:r>
+              <w:rPr>
+                <w:rFonts w:ascii="Calibri" w:hAnsi="Calibri"/>
+                <w:i/>
+                <w:color w:val="465C7A"/>
+                <w:sz w:val="21"/>
+              </w:rPr>
+              <w:t>Conditioning on income using lattice::xyplot reveals that high-income earners maintain a substantially higher average working volume (mean 45.5 vs 38.8 hours) consistently across all working ages, with part-time work almost entirely absent from the &gt;$50K cohort. This multi-panel trellis structure provides clearer visual separation than single-panel color-coded scatter plots.</w:t>
+            </w:r>
+          </w:p>
+        </w:tc>
+      </w:tr>
+    </w:tbl>
+    <w:p/>
+    <w:p>
+      <w:r>
+        <w:br w:type="page"/>
+      </w:r>
+    </w:p>
+    <w:p>
+      <w:pPr>
+        <w:pStyle w:val="Heading1"/>
+        <w:keepNext/>
+        <w:spacing w:before="280" w:after="80"/>
+      </w:pPr>
+      <w:r>
+        <w:rPr>
+          <w:rFonts w:ascii="Calibri" w:hAnsi="Calibri"/>
+          <w:b/>
+          <w:color w:val="1B365D"/>
+          <w:sz w:val="36"/>
+        </w:rPr>
+        <w:t>Supplementary Visualization 15 — Base R: Age Distribution</w:t>
+      </w:r>
+    </w:p>
+    <w:p>
+      <w:pPr>
+        <w:pStyle w:val="Heading3"/>
+        <w:keepNext/>
+        <w:spacing w:before="200" w:after="80"/>
+      </w:pPr>
+      <w:r>
+        <w:rPr>
+          <w:rFonts w:ascii="Calibri" w:hAnsi="Calibri"/>
+          <w:b/>
+          <w:color w:val="465C7A"/>
+          <w:sz w:val="24"/>
+        </w:rPr>
+        <w:t>Purpose</w:t>
+      </w:r>
+    </w:p>
+    <w:p>
+      <w:pPr>
+        <w:spacing w:after="120" w:line="276" w:lineRule="auto"/>
+      </w:pPr>
+      <w:r>
+        <w:rPr>
+          <w:rFonts w:ascii="Calibri" w:hAnsi="Calibri"/>
+          <w:color w:val="212529"/>
+          <w:sz w:val="22"/>
+        </w:rPr>
+        <w:t>To illustrate the age distribution of the surveyed workforce using Base R graphics (graphics::hist), demonstrating native R plotting capabilities and providing an independent verification of workforce demographic structure without external packages.</w:t>
+      </w:r>
+    </w:p>
+    <w:p>
+      <w:pPr>
+        <w:pStyle w:val="Heading3"/>
+        <w:keepNext/>
+        <w:spacing w:before="200" w:after="80"/>
+      </w:pPr>
+      <w:r>
+        <w:rPr>
+          <w:rFonts w:ascii="Calibri" w:hAnsi="Calibri"/>
+          <w:b/>
+          <w:color w:val="465C7A"/>
+          <w:sz w:val="24"/>
+        </w:rPr>
+        <w:t>Why Base R Was Used</w:t>
+      </w:r>
+    </w:p>
+    <w:p>
+      <w:pPr>
+        <w:spacing w:after="120" w:line="276" w:lineRule="auto"/>
+      </w:pPr>
+      <w:r>
+        <w:rPr>
+          <w:rFonts w:ascii="Calibri" w:hAnsi="Calibri"/>
+          <w:color w:val="212529"/>
+          <w:sz w:val="22"/>
+        </w:rPr>
+        <w:t>While modern tidyverse workflows prioritize ggplot2, Base R graphics remain a core competency for R programmers. Base graphics require zero external dependencies, render with near-instantaneous execution speed, and offer direct low-level canvas control through functions like hist(), abline(), and legend(). Including this visualization satisfies the assignment expectation to demonstrate base R plotting, showing that core demographic findings are reproducible across R's graphical ecosystems.</w:t>
+      </w:r>
+    </w:p>
+    <w:p>
+      <w:pPr>
+        <w:pStyle w:val="Heading3"/>
+        <w:keepNext/>
+        <w:spacing w:before="200" w:after="80"/>
+      </w:pPr>
+      <w:r>
+        <w:rPr>
+          <w:rFonts w:ascii="Calibri" w:hAnsi="Calibri"/>
+          <w:b/>
+          <w:color w:val="465C7A"/>
+          <w:sz w:val="24"/>
+        </w:rPr>
+        <w:t>R Code</w:t>
+      </w:r>
+    </w:p>
+    <w:tbl>
+      <w:tblPr>
+        <w:tblW w:type="auto" w:w="0"/>
+        <w:jc w:val="left"/>
+        <w:tblLayout w:type="fixed"/>
+        <w:tblLook w:firstColumn="1" w:firstRow="1" w:lastColumn="0" w:lastRow="0" w:noHBand="0" w:noVBand="1" w:val="04A0"/>
+      </w:tblPr>
+      <w:tblGrid>
+        <w:gridCol w:w="9072"/>
+      </w:tblGrid>
+      <w:tr>
+        <w:tc>
+          <w:tcPr>
+            <w:tcW w:type="dxa" w:w="9360"/>
+            <w:shd w:fill="1E1E2E"/>
+            <w:tcMar>
+              <w:top w:w="150" w:type="dxa"/>
+              <w:bottom w:w="150" w:type="dxa"/>
+              <w:left w:w="200" w:type="dxa"/>
+              <w:right w:w="200" w:type="dxa"/>
+            </w:tcMar>
+          </w:tcPr>
+          <w:p>
+            <w:r>
+              <w:rPr>
+                <w:rFonts w:ascii="Consolas" w:hAnsi="Consolas"/>
+                <w:color w:val="CDD6F4"/>
+                <w:sz w:val="17"/>
+              </w:rPr>
+              <w:t>png("plots/week2_15_base_age_histogram.png", width = 2700, height = 1800, res = 300)</w:t>
+              <w:br/>
+              <w:t>par(mar = c(5, 5, 4, 2) + 0.1, bg = "#FFFFFF", family = "sans")</w:t>
+              <w:br/>
+              <w:br/>
+              <w:t>h &lt;- hist(</w:t>
+              <w:br/>
+              <w:t xml:space="preserve">  adult$age,</w:t>
+              <w:br/>
+              <w:t xml:space="preserve">  breaks = seq(15, 95, by = 5),</w:t>
+              <w:br/>
+              <w:t xml:space="preserve">  col = "#4A90E2",</w:t>
+              <w:br/>
+              <w:t xml:space="preserve">  border = "#1B365D",</w:t>
+              <w:br/>
+              <w:t xml:space="preserve">  main = "Figure 15. Supplementary Base R Plot: Age Distribution Histogram",</w:t>
+              <w:br/>
+              <w:t xml:space="preserve">  xlab = "Age (Years)",</w:t>
+              <w:br/>
+              <w:t xml:space="preserve">  ylab = "Frequency (Count)",</w:t>
+              <w:br/>
+              <w:t xml:space="preserve">  cex.main = 1.25, col.main = "#1B365D",</w:t>
+              <w:br/>
+              <w:t xml:space="preserve">  cex.lab = 1.05, font.lab = 2,</w:t>
+              <w:br/>
+              <w:t xml:space="preserve">  las = 1, ylim = c(0, 6500)</w:t>
+              <w:br/>
+              <w:t>)</w:t>
+              <w:br/>
+              <w:br/>
+              <w:t>grid(nx = NA, ny = NULL, col = "#E9ECEF", lty = 1, lwd = 1)</w:t>
+              <w:br/>
+              <w:t>plot(h, col = "#4A90E2", border = "#1B365D", add = TRUE)</w:t>
+              <w:br/>
+              <w:br/>
+              <w:t>abline(v = median(adult$age), col = "#D9534F", lwd = 2.5, lty = 2)</w:t>
+              <w:br/>
+              <w:t>abline(v = mean(adult$age), col = "#F5A623", lwd = 2.5, lty = 1)</w:t>
+              <w:br/>
+              <w:br/>
+              <w:t>legend(</w:t>
+              <w:br/>
+              <w:t xml:space="preserve">  "topright",</w:t>
+              <w:br/>
+              <w:t xml:space="preserve">  legend = c(</w:t>
+              <w:br/>
+              <w:t xml:space="preserve">    sprintf("Median: %d years", as.integer(median(adult$age))),</w:t>
+              <w:br/>
+              <w:t xml:space="preserve">    sprintf("Mean: %.1f years", mean(adult$age)),</w:t>
+              <w:br/>
+              <w:t xml:space="preserve">    sprintf("N = %s", format(nrow(adult), big.mark = ","))</w:t>
+              <w:br/>
+              <w:t xml:space="preserve">  ),</w:t>
+              <w:br/>
+              <w:t xml:space="preserve">  col = c("#D9534F", "#F5A623", "transparent"),</w:t>
+              <w:br/>
+              <w:t xml:space="preserve">  lty = c(2, 1, 0), lwd = c(2.5, 2.5, 0), bty = "n", cex = 0.95</w:t>
+              <w:br/>
+              <w:t>)</w:t>
+              <w:br/>
+              <w:t>dev.off()</w:t>
+            </w:r>
+          </w:p>
+        </w:tc>
+      </w:tr>
+    </w:tbl>
+    <w:p/>
+    <w:p>
+      <w:pPr>
+        <w:pStyle w:val="Heading3"/>
+        <w:keepNext/>
+        <w:spacing w:before="200" w:after="80"/>
+      </w:pPr>
+      <w:r>
+        <w:rPr>
+          <w:rFonts w:ascii="Calibri" w:hAnsi="Calibri"/>
+          <w:b/>
+          <w:color w:val="465C7A"/>
+          <w:sz w:val="24"/>
+        </w:rPr>
+        <w:t>Output</w:t>
+      </w:r>
+    </w:p>
+    <w:p>
+      <w:pPr>
+        <w:jc w:val="center"/>
+      </w:pPr>
+      <w:r>
+        <w:drawing>
+          <wp:inline xmlns:a="http://schemas.openxmlformats.org/drawingml/2006/main" xmlns:pic="http://schemas.openxmlformats.org/drawingml/2006/picture">
+            <wp:extent cx="5486400" cy="3657600"/>
+            <wp:docPr id="15" name="Picture 15"/>
+            <wp:cNvGraphicFramePr>
+              <a:graphicFrameLocks noChangeAspect="1"/>
+            </wp:cNvGraphicFramePr>
+            <a:graphic>
+              <a:graphicData uri="http://schemas.openxmlformats.org/drawingml/2006/picture">
+                <pic:pic>
+                  <pic:nvPicPr>
+                    <pic:cNvPr id="0" name="week2_15_base_age_histogram.png"/>
+                    <pic:cNvPicPr/>
+                  </pic:nvPicPr>
+                  <pic:blipFill>
+                    <a:blip r:embed="rId23"/>
+                    <a:stretch>
+                      <a:fillRect/>
+                    </a:stretch>
+                  </pic:blipFill>
+                  <pic:spPr>
+                    <a:xfrm>
+                      <a:off x="0" y="0"/>
+                      <a:ext cx="5486400" cy="3657600"/>
+                    </a:xfrm>
+                    <a:prstGeom prst="rect"/>
+                  </pic:spPr>
+                </pic:pic>
+              </a:graphicData>
+            </a:graphic>
+          </wp:inline>
+        </w:drawing>
+      </w:r>
+    </w:p>
+    <w:p>
+      <w:pPr>
+        <w:spacing w:after="240"/>
+        <w:jc w:val="center"/>
+      </w:pPr>
+      <w:r>
+        <w:rPr>
+          <w:rFonts w:ascii="Calibri" w:hAnsi="Calibri"/>
+          <w:i/>
+          <w:color w:val="6C757D"/>
+          <w:sz w:val="19"/>
+        </w:rPr>
+        <w:t>Figure 15. Supplementary Base R Plot: Age Distribution Histogram (graphics::hist)</w:t>
+      </w:r>
+    </w:p>
+    <w:p>
+      <w:pPr>
+        <w:pStyle w:val="Heading3"/>
+        <w:keepNext/>
+        <w:spacing w:before="200" w:after="80"/>
+      </w:pPr>
+      <w:r>
+        <w:rPr>
+          <w:rFonts w:ascii="Calibri" w:hAnsi="Calibri"/>
+          <w:b/>
+          <w:color w:val="465C7A"/>
+          <w:sz w:val="24"/>
+        </w:rPr>
+        <w:t>Interpretation</w:t>
+      </w:r>
+    </w:p>
+    <w:p>
+      <w:pPr>
+        <w:spacing w:after="120" w:line="276" w:lineRule="auto"/>
+      </w:pPr>
+      <w:r>
+        <w:rPr>
+          <w:rFonts w:ascii="Calibri" w:hAnsi="Calibri"/>
+          <w:color w:val="212529"/>
+          <w:sz w:val="22"/>
+        </w:rPr>
+        <w:t>The Base R histogram confirms the unimodal, moderately right-skewed profile of the adult workforce (skewness = +0.558). The peak 5-year bin spans ages 30 to 35, containing over 4,500 individuals, while ages 20 to 45 form the dense core of the labor market. The vertical dashed line at 37 years denotes the sample median, while the solid line at 38.6 years marks the arithmetic mean, visually demonstrating the rightward pull exerted by older workers extending out to age 90.</w:t>
+      </w:r>
+    </w:p>
+    <w:p>
+      <w:pPr>
+        <w:pStyle w:val="Heading3"/>
+        <w:keepNext/>
+        <w:spacing w:before="200" w:after="80"/>
+      </w:pPr>
+      <w:r>
+        <w:rPr>
+          <w:rFonts w:ascii="Calibri" w:hAnsi="Calibri"/>
+          <w:b/>
+          <w:color w:val="465C7A"/>
+          <w:sz w:val="24"/>
+        </w:rPr>
+        <w:t>Key Insight</w:t>
+      </w:r>
+    </w:p>
+    <w:tbl>
+      <w:tblPr>
+        <w:tblW w:type="auto" w:w="0"/>
+        <w:jc w:val="center"/>
+        <w:tblLayout w:type="fixed"/>
+        <w:tblLook w:firstColumn="1" w:firstRow="1" w:lastColumn="0" w:lastRow="0" w:noHBand="0" w:noVBand="1" w:val="04A0"/>
+      </w:tblPr>
+      <w:tblGrid>
+        <w:gridCol w:w="9072"/>
+      </w:tblGrid>
+      <w:tr>
+        <w:tc>
+          <w:tcPr>
+            <w:tcW w:type="dxa" w:w="9360"/>
+            <w:shd w:fill="F0F4F8"/>
+            <w:tcMar>
+              <w:top w:w="120" w:type="dxa"/>
+              <w:bottom w:w="120" w:type="dxa"/>
+              <w:left w:w="180" w:type="dxa"/>
+              <w:right w:w="180" w:type="dxa"/>
+            </w:tcMar>
+          </w:tcPr>
+          <w:p>
+            <w:pPr>
+              <w:spacing w:before="40" w:after="40"/>
+            </w:pPr>
+            <w:r>
+              <w:rPr>
+                <w:rFonts w:ascii="Calibri" w:hAnsi="Calibri"/>
+                <w:i/>
+                <w:color w:val="465C7A"/>
+                <w:sz w:val="21"/>
+              </w:rPr>
+              <w:t>Generating the age distribution through Base R graphics corroborates the exact demographic metrics derived via ggplot2 (median = 37, mean = 38.6), verifying that analytical conclusions remain invariant to the choice of graphics engine.</w:t>
+            </w:r>
+          </w:p>
+        </w:tc>
+      </w:tr>
+    </w:tbl>
+    <w:p/>
     <w:p>
       <w:r>
         <w:br w:type="page"/>
@@ -8459,7 +9291,7 @@
           <w:color w:val="212529"/>
           <w:sz w:val="22"/>
         </w:rPr>
-        <w:t>This Week 2 report has presented a comprehensive data visualization and insight communication analysis of the UCI Adult / Census Income Dataset. Twelve primary visualizations (Figures 1–12) and one supplementary cohort trend chart (Figure 13) were produced using ggplot2 in R, each selected on the basis of the data type and analytical question it was designed to address.</w:t>
+        <w:t>This Week 2 report has presented a comprehensive data visualization and insight communication analysis of the UCI Adult / Census Income Dataset. A total of 15 publication-grade visualizations were produced across R's three major graphical ecosystems: twelve core ggplot2 visualizations (Figures 1–12), one ordered cohort trend visualization (Figure 13), one multipanel conditioning plot in lattice (Figure 14), and one native distribution plot in Base R (Figure 15).</w:t>
       </w:r>
     </w:p>
     <w:p>
@@ -8472,7 +9304,7 @@
           <w:color w:val="212529"/>
           <w:sz w:val="22"/>
         </w:rPr>
-        <w:t>The analysis revealed several consistent patterns: income class imbalance (75.9% &lt;=50K), a monotonic education–income association (0% to 74% high income from Preschool to Doctorate), dramatic occupational stratification (0.7% to 48.4% across occupations), an older age profile for high earners (median 44 vs 34 years), and strong institutional anchoring at the 40-hour workweek (46.7% of the workforce). Capital gain is concentrated among a small minority (8.3%) with extreme skewness requiring log-scale treatment.</w:t>
+        <w:t>The analysis revealed several consistent patterns: income class imbalance (75.91% &lt;=50K), a monotonic education–income association (0% to 74.09% high income from Preschool to Doctorate), dramatic occupational stratification (0.68% to 48.41% across occupations), an older age profile for high earners (median 44 vs 34 years), and strong institutional anchoring at the 40-hour workweek (46.73% of the workforce). Capital gain is concentrated among a small minority (8.34%) with extreme skewness requiring log-scale treatment.</w:t>
       </w:r>
     </w:p>
     <w:p>
@@ -8485,7 +9317,7 @@
           <w:color w:val="212529"/>
           <w:sz w:val="22"/>
         </w:rPr>
-        <w:t>All insights are grounded in actual computed statistics from the dataset. Causal language was avoided throughout, and limitations of the cross-sectional, 30-year-old, weighted survey design were explicitly acknowledged. The Week 1 pipeline remains fully intact and reproducible alongside this Week 2 extension within the same GitHub repository.</w:t>
+        <w:t>All insights are strictly grounded in actual computed statistics from the dataset. Causal language was avoided throughout, and limitations of the cross-sectional, 30-year-old, weighted survey design were explicitly acknowledged. The Week 1 pipeline remains fully intact and reproducible alongside this Week 2 extension within the same GitHub repository.</w:t>
       </w:r>
     </w:p>
     <w:p>
@@ -8548,7 +9380,7 @@
           <w:color w:val="212529"/>
           <w:sz w:val="21"/>
         </w:rPr>
-        <w:t>3. Wickham, H., François, R., Henry, L., &amp; Müller, K. (2023). dplyr: A Grammar of Data Manipulation. R package version 1.1.x. https://dplyr.tidyverse.org</w:t>
+        <w:t>3. Sarkar, D. (2008). Lattice: Multivariate Data Visualization with R. Springer Science &amp; Business Media. https://doi.org/10.1007/978-0-387-75969-2</w:t>
       </w:r>
     </w:p>
     <w:p>
@@ -8562,7 +9394,7 @@
           <w:color w:val="212529"/>
           <w:sz w:val="21"/>
         </w:rPr>
-        <w:t>4. Wickham, H., &amp; Girlich, M. (2023). tidyr: Tidy Messy Data. R package version 1.3.x. https://tidyr.tidyverse.org</w:t>
+        <w:t>4. Cleveland, W. S. (1993). Visualizing Data. Hobart Press.</w:t>
       </w:r>
     </w:p>
     <w:p>
@@ -8576,7 +9408,7 @@
           <w:color w:val="212529"/>
           <w:sz w:val="21"/>
         </w:rPr>
-        <w:t>5. Wei, T., &amp; Simko, V. (2021). corrplot: Visualization of a Correlation Matrix. R package version 0.92. https://CRAN.R-project.org/package=corrplot</w:t>
+        <w:t>5. R Core Team. (2024). R: A Language and Environment for Statistical Computing. R Foundation for Statistical Computing, Vienna, Austria. https://www.R-project.org/</w:t>
       </w:r>
     </w:p>
     <w:p>
@@ -8590,7 +9422,7 @@
           <w:color w:val="212529"/>
           <w:sz w:val="21"/>
         </w:rPr>
-        <w:t>6. Wickham, H. (2023). scales: Scale Functions for Visualization. R package version 1.3.x. https://scales.r-lib.org</w:t>
+        <w:t>6. Wickham, H., François, R., Henry, L., &amp; Müller, K. (2023). dplyr: A Grammar of Data Manipulation. R package version 1.1.x. https://dplyr.tidyverse.org</w:t>
       </w:r>
     </w:p>
     <w:p>
@@ -8604,7 +9436,7 @@
           <w:color w:val="212529"/>
           <w:sz w:val="21"/>
         </w:rPr>
-        <w:t>7. Grolemund, G., &amp; Wickham, H. (2017). R for Data Science. O'Reilly Media. https://r4ds.had.co.nz</w:t>
+        <w:t>7. Wickham, H., &amp; Girlich, M. (2023). tidyr: Tidy Messy Data. R package version 1.3.x. https://tidyr.tidyverse.org</w:t>
       </w:r>
     </w:p>
     <w:p>
@@ -8618,7 +9450,7 @@
           <w:color w:val="212529"/>
           <w:sz w:val="21"/>
         </w:rPr>
-        <w:t>8. Tufte, E. R. (2001). The Visual Display of Quantitative Information (2nd ed.). Graphics Press.</w:t>
+        <w:t>8. Wei, T., &amp; Simko, V. (2021). corrplot: Visualization of a Correlation Matrix. R package version 0.92. https://CRAN.R-project.org/package=corrplot</w:t>
       </w:r>
     </w:p>
     <w:p>
@@ -8632,7 +9464,7 @@
           <w:color w:val="212529"/>
           <w:sz w:val="21"/>
         </w:rPr>
-        <w:t>9. Cairo, A. (2016). The Truthful Art: Data, Charts, and Maps for Communication. New Riders.</w:t>
+        <w:t>9. Wickham, H. (2023). scales: Scale Functions for Visualization. R package version 1.3.x. https://scales.r-lib.org</w:t>
       </w:r>
     </w:p>
     <w:p>
@@ -8646,7 +9478,49 @@
           <w:color w:val="212529"/>
           <w:sz w:val="21"/>
         </w:rPr>
-        <w:t>10. U.S. Census Bureau. (1994). Current Population Survey (CPS) — Annual Social and Economic Supplement. U.S. Department of Commerce.</w:t>
+        <w:t>10. Grolemund, G., &amp; Wickham, H. (2017). R for Data Science. O'Reilly Media. https://r4ds.had.co.nz</w:t>
+      </w:r>
+    </w:p>
+    <w:p>
+      <w:pPr>
+        <w:spacing w:after="80"/>
+        <w:ind w:hanging="432" w:left="432"/>
+      </w:pPr>
+      <w:r>
+        <w:rPr>
+          <w:rFonts w:ascii="Calibri" w:hAnsi="Calibri"/>
+          <w:color w:val="212529"/>
+          <w:sz w:val="21"/>
+        </w:rPr>
+        <w:t>11. Tufte, E. R. (2001). The Visual Display of Quantitative Information (2nd ed.). Graphics Press.</w:t>
+      </w:r>
+    </w:p>
+    <w:p>
+      <w:pPr>
+        <w:spacing w:after="80"/>
+        <w:ind w:hanging="432" w:left="432"/>
+      </w:pPr>
+      <w:r>
+        <w:rPr>
+          <w:rFonts w:ascii="Calibri" w:hAnsi="Calibri"/>
+          <w:color w:val="212529"/>
+          <w:sz w:val="21"/>
+        </w:rPr>
+        <w:t>12. Cairo, A. (2016). The Truthful Art: Data, Charts, and Maps for Communication. New Riders.</w:t>
+      </w:r>
+    </w:p>
+    <w:p>
+      <w:pPr>
+        <w:spacing w:after="80"/>
+        <w:ind w:hanging="432" w:left="432"/>
+      </w:pPr>
+      <w:r>
+        <w:rPr>
+          <w:rFonts w:ascii="Calibri" w:hAnsi="Calibri"/>
+          <w:color w:val="212529"/>
+          <w:sz w:val="21"/>
+        </w:rPr>
+        <w:t>13. U.S. Census Bureau. (1994). Current Population Survey (CPS) — Annual Social and Economic Supplement. U.S. Department of Commerce.</w:t>
       </w:r>
     </w:p>
     <w:p>
@@ -8695,7 +9569,7 @@
           <w:color w:val="212529"/>
           <w:sz w:val="22"/>
         </w:rPr>
-        <w:t>R/08_week2_visualizations.R — All 13 ggplot2 visualization figures</w:t>
+        <w:t>R/08_week2_visualizations.R — All 15 visualization figures (ggplot2, lattice, and Base R)</w:t>
       </w:r>
     </w:p>
     <w:p>
@@ -8784,6 +9658,8 @@
               <w:br/>
               <w:t xml:space="preserve">  library(reshape2)</w:t>
               <w:br/>
+              <w:t xml:space="preserve">  library(lattice)</w:t>
+              <w:br/>
               <w:t>})</w:t>
               <w:br/>
               <w:br/>
@@ -8883,7 +9759,7 @@
               <w:br/>
               <w:t xml:space="preserve">    plot.background    = element_rect(fill = "white", color = NA),</w:t>
               <w:br/>
-              <w:t xml:space="preserve">    panel.background   = element_rect(fill = "white"</w:t>
+              <w:t xml:space="preserve">    panel.background   = element_</w:t>
             </w:r>
           </w:p>
         </w:tc>
@@ -8919,7 +9795,7 @@
                 <w:color w:val="CDD6F4"/>
                 <w:sz w:val="17"/>
               </w:rPr>
-              <w:t>, color = NA)</w:t>
+              <w:t>rect(fill = "white", color = NA)</w:t>
               <w:br/>
               <w:t xml:space="preserve">  )</w:t>
               <w:br/>
@@ -9035,9 +9911,7 @@
               <w:br/>
               <w:t># -----------------------------------------------------------------------------</w:t>
               <w:br/>
-              <w:t>cat("3. Generating week2_03_education_distribution.png...\n")</w:t>
-              <w:br/>
-              <w:t>df_edu &lt;- adul</w:t>
+              <w:t>cat("3. Generating week2_03_education_distribution.png...</w:t>
             </w:r>
           </w:p>
         </w:tc>
@@ -9073,7 +9947,9 @@
                 <w:color w:val="CDD6F4"/>
                 <w:sz w:val="17"/>
               </w:rPr>
-              <w:t>t %&gt;%</w:t>
+              <w:t>\n")</w:t>
+              <w:br/>
+              <w:t>df_edu &lt;- adult %&gt;%</w:t>
               <w:br/>
               <w:t xml:space="preserve">  count(education, education_num) %&gt;%</w:t>
               <w:br/>
@@ -9198,7 +10074,7 @@
               <w:br/>
               <w:t># -----------------------------------------------------------------------------</w:t>
               <w:br/>
-              <w:t># VISUALIZATION 5: Workclass vs Income (Proportional St</w:t>
+              <w:t># VISUALIZATION 5: Workclass vs Inco</w:t>
             </w:r>
           </w:p>
         </w:tc>
@@ -9234,7 +10110,7 @@
                 <w:color w:val="CDD6F4"/>
                 <w:sz w:val="17"/>
               </w:rPr>
-              <w:t>acked Bar Chart)</w:t>
+              <w:t>me (Proportional Stacked Bar Chart)</w:t>
               <w:br/>
               <w:t># -----------------------------------------------------------------------------</w:t>
               <w:br/>
@@ -9365,7 +10241,7 @@
               <w:br/>
               <w:t xml:space="preserve">           size = 3.8, fontface = "bold", color = col_low) +</w:t>
               <w:br/>
-              <w:t xml:space="preserve">  annotate("text", x = 2, y = 88, labe</w:t>
+              <w:t xml:space="preserve">  annotate("text",</w:t>
             </w:r>
           </w:p>
         </w:tc>
@@ -9401,7 +10277,7 @@
                 <w:color w:val="CDD6F4"/>
                 <w:sz w:val="17"/>
               </w:rPr>
-              <w:t>l = sprintf("Median: %d | IQR: [%d, %d]\nMean: %.1f yrs",</w:t>
+              <w:t>x = 2, y = 88, label = sprintf("Median: %d | IQR: [%d, %d]\nMean: %.1f yrs",</w:t>
               <w:br/>
               <w:t xml:space="preserve">                                                   age_stats$med[2], age_stats$q1[2], age_stats$q3[2], age_stats$mean[2]),</w:t>
               <w:br/>
@@ -9507,7 +10383,7 @@
               <w:t xml:space="preserve">  )</w:t>
               <w:br/>
               <w:br/>
-              <w:t>p8 &lt;- ggplot(adult, aes(x</w:t>
+              <w:t>p8 &lt;-</w:t>
             </w:r>
           </w:p>
         </w:tc>
@@ -9543,7 +10419,7 @@
                 <w:color w:val="CDD6F4"/>
                 <w:sz w:val="17"/>
               </w:rPr>
-              <w:t>= income, y = hours_per_week, fill = income)) +</w:t>
+              <w:t>ggplot(adult, aes(x = income, y = hours_per_week, fill = income)) +</w:t>
               <w:br/>
               <w:t xml:space="preserve">  geom_violin(alpha = 0.5, trim = FALSE, color = "#2C3E50", linewidth = 0.4) +</w:t>
               <w:br/>
@@ -9636,7 +10512,7 @@
               <w:br/>
               <w:t># -----------------------------------------------------------------------------</w:t>
               <w:br/>
-              <w:t># VISUALIZATION 10: Capital Gain Distribution (Log-Scale &amp; Zero Han</w:t>
+              <w:t># VISUALIZATION 10: Capital Gain Distribution (L</w:t>
             </w:r>
           </w:p>
         </w:tc>
@@ -9672,7 +10548,7 @@
                 <w:color w:val="CDD6F4"/>
                 <w:sz w:val="17"/>
               </w:rPr>
-              <w:t>dling)</w:t>
+              <w:t>og-Scale &amp; Zero Handling)</w:t>
               <w:br/>
               <w:t># -----------------------------------------------------------------------------</w:t>
               <w:br/>
@@ -9928,9 +10804,7 @@
               <w:br/>
               <w:t>cat("13. Generating week2_13_age_cohort_income_trend.png...\n")</w:t>
               <w:br/>
-              <w:t>adult_cohort &lt;- adult %&gt;%</w:t>
-              <w:br/>
-              <w:t xml:space="preserve">  mutate(</w:t>
+              <w:t>adult_cohort &lt;- adu</w:t>
             </w:r>
           </w:p>
         </w:tc>
@@ -9966,7 +10840,11 @@
                 <w:color w:val="CDD6F4"/>
                 <w:sz w:val="17"/>
               </w:rPr>
-              <w:t>age_cohort = cut(</w:t>
+              <w:t>lt %&gt;%</w:t>
+              <w:br/>
+              <w:t xml:space="preserve">  mutate(</w:t>
+              <w:br/>
+              <w:t xml:space="preserve">    age_cohort = cut(</w:t>
               <w:br/>
               <w:t xml:space="preserve">      age,</w:t>
               <w:br/>
@@ -10009,13 +10887,13 @@
               <w:br/>
               <w:t xml:space="preserve">    title = "Figure 13. Life-Cycle Cohort Trend: High-Income Rate Across Age Brackets",</w:t>
               <w:br/>
-              <w:t xml:space="preserve">    subtitle = "Analytical demonstration: Inverted U-curve peaking in the 46–55 cohort (40.0%), declining in retirement ages (66+)",</w:t>
+              <w:t xml:space="preserve">    subtitle = "Cross-sectional cohort profile: Proportion &gt;$50K rises from 1.8% (17–25) to peak of 39.9% (46–55), declining to 20.1% (66+)",</w:t>
               <w:br/>
               <w:t xml:space="preserve">    x = "Cross-Sectional Age Cohort (Lifespan Bracket)",</w:t>
               <w:br/>
               <w:t xml:space="preserve">    y = "Proportion Earning &gt;$50,000 (%)",</w:t>
               <w:br/>
-              <w:t xml:space="preserve">    caption = "NOTE: Represents synthetic cross-sectional age cohorts, NOT a longitudinal time-series."</w:t>
+              <w:t xml:space="preserve">    caption = "Source: UCI Adult Dataset | N = 32,537 | Cross-sectional cohort comparison, NOT a longitudinal time-series."</w:t>
               <w:br/>
               <w:t xml:space="preserve">  ) +</w:t>
               <w:br/>
@@ -10025,7 +10903,219 @@
               <w:t>ggsave(file.path(plots_dir, "week2_13_age_cohort_income_trend.png"), p13, width = 8, height = 5.2, dpi = 300)</w:t>
               <w:br/>
               <w:br/>
-              <w:t>cat("\nAll 13 Week 2 visualizations generated successfully and saved to plots/\n")</w:t>
+              <w:t># -----------------------------------------------------------------------------</w:t>
+              <w:br/>
+              <w:t># SUPPLEMENTARY VISUALIZATION 14: Lattice Conditioning Plot (Age vs Hours by Income)</w:t>
+              <w:br/>
+              <w:t># -----------------------------------------------------------------------------</w:t>
+              <w:br/>
+              <w:t>cat("14. Generating week2_14_lattice_age_hours_income.png using lattice::xyplot...\n")</w:t>
+              <w:br/>
+              <w:t>lattice_plot_path &lt;- file.path(plots_dir, "week2_14_lattice_age_hours_income.png")</w:t>
+              <w:br/>
+              <w:br/>
+              <w:t>png(filename = lattice_plot_path, width = 2700, height = 1800, res = 300)</w:t>
+              <w:br/>
+              <w:t>lattice_theme &lt;- list(</w:t>
+              <w:br/>
+              <w:t xml:space="preserve">  strip.background = list(col = "#1B365D"),</w:t>
+              <w:br/>
+              <w:t xml:space="preserve">  strip.text = list(col = "white", font = 2, cex = 1.05),</w:t>
+              <w:br/>
+              <w:t xml:space="preserve">  axis.line = list(col = "#6C757D"),</w:t>
+              <w:br/>
+              <w:t xml:space="preserve">  axis.text = list(cex = 0.9, col = "#212529")</w:t>
+              <w:br/>
+              <w:t>)</w:t>
+              <w:br/>
+              <w:br/>
+              <w:t>p14_lattice &lt;- xyplot(</w:t>
+              <w:br/>
+              <w:t xml:space="preserve">  hours_per_week ~ age | income,</w:t>
+              <w:br/>
+              <w:t xml:space="preserve">  data = adult,</w:t>
+              <w:br/>
+              <w:t xml:space="preserve">  par.settings = lattice_theme,</w:t>
+              <w:br/>
+              <w:t xml:space="preserve">  pch = 16,</w:t>
+              <w:br/>
+              <w:t xml:space="preserve">  cex = 0.55,</w:t>
+              <w:br/>
+              <w:t xml:space="preserve">  alpha = 0.22,</w:t>
+              <w:br/>
+              <w:t xml:space="preserve">  col = "#4A90E2",</w:t>
+              <w:br/>
+              <w:t xml:space="preserve">  grid = TRUE,</w:t>
+              <w:br/>
+              <w:t xml:space="preserve">  type = c("p", "r"),</w:t>
+              <w:br/>
+              <w:t xml:space="preserve">  lwd = 2.5,</w:t>
+              <w:br/>
+              <w:t xml:space="preserve">  col.line = "#D9534F",</w:t>
+              <w:br/>
+              <w:t xml:space="preserve">  xlab = list("Age (Years)", font = 2, cex = 1.05, col = "#212529"),</w:t>
+              <w:br/>
+              <w:t xml:space="preserve">  ylab = list("Hours Worked per Week", font = 2, cex = 1.05, col = "#212529"),</w:t>
+              <w:br/>
+              <w:t xml:space="preserve">  main = list(</w:t>
+              <w:br/>
+              <w:t xml:space="preserve">    label = "Figure 14. Supplementary Lattice Plot: Weekly Hours vs Age Stratified by Income",</w:t>
+              <w:br/>
+              <w:t xml:space="preserve">    font = 2, cex = 1.15, col = "#1B365D"</w:t>
+              <w:br/>
+              <w:t xml:space="preserve">  ),</w:t>
+              <w:br/>
+              <w:t xml:space="preserve">  sub = list(</w:t>
+              <w:br/>
+              <w:t xml:space="preserve">    label = "Trellis multi-panel display: Linear fit (red line) across &lt;=50K (left) and &gt;50K (right) subsets",</w:t>
+              <w:br/>
+              <w:t xml:space="preserve">    font = 1, cex = 0.85, col = "#465C7A"</w:t>
+              <w:br/>
+              <w:t xml:space="preserve">  ),</w:t>
+              <w:br/>
+              <w:t xml:space="preserve">  layout = c(2, 1)</w:t>
+              <w:br/>
+              <w:t>)</w:t>
+              <w:br/>
+              <w:t>print(p14_lattice)</w:t>
+              <w:br/>
+              <w:t>dev.off()</w:t>
+              <w:br/>
+              <w:br/>
+              <w:t># -----------------------------------------------------------------------------</w:t>
+              <w:br/>
+              <w:t># SUPPLEMENTARY VISUALIZATION 15: Base R Age Distribution Histogram</w:t>
+              <w:br/>
+              <w:t># --------------------------------------------------</w:t>
+            </w:r>
+          </w:p>
+        </w:tc>
+      </w:tr>
+    </w:tbl>
+    <w:p/>
+    <w:tbl>
+      <w:tblPr>
+        <w:tblW w:type="auto" w:w="0"/>
+        <w:jc w:val="left"/>
+        <w:tblLayout w:type="fixed"/>
+        <w:tblLook w:firstColumn="1" w:firstRow="1" w:lastColumn="0" w:lastRow="0" w:noHBand="0" w:noVBand="1" w:val="04A0"/>
+      </w:tblPr>
+      <w:tblGrid>
+        <w:gridCol w:w="9072"/>
+      </w:tblGrid>
+      <w:tr>
+        <w:tc>
+          <w:tcPr>
+            <w:tcW w:type="dxa" w:w="9360"/>
+            <w:shd w:fill="1E1E2E"/>
+            <w:tcMar>
+              <w:top w:w="150" w:type="dxa"/>
+              <w:bottom w:w="150" w:type="dxa"/>
+              <w:left w:w="200" w:type="dxa"/>
+              <w:right w:w="200" w:type="dxa"/>
+            </w:tcMar>
+          </w:tcPr>
+          <w:p>
+            <w:r>
+              <w:rPr>
+                <w:rFonts w:ascii="Consolas" w:hAnsi="Consolas"/>
+                <w:color w:val="CDD6F4"/>
+                <w:sz w:val="17"/>
+              </w:rPr>
+              <w:t>---------------------------</w:t>
+              <w:br/>
+              <w:t>cat("15. Generating week2_15_base_age_histogram.png using base R graphics...\n")</w:t>
+              <w:br/>
+              <w:t>base_plot_path &lt;- file.path(plots_dir, "week2_15_base_age_histogram.png")</w:t>
+              <w:br/>
+              <w:br/>
+              <w:t>png(filename = base_plot_path, width = 2700, height = 1800, res = 300)</w:t>
+              <w:br/>
+              <w:t>par(mar = c(5, 5, 4, 2) + 0.1, bg = "#FFFFFF", family = "sans")</w:t>
+              <w:br/>
+              <w:br/>
+              <w:t>h &lt;- hist(</w:t>
+              <w:br/>
+              <w:t xml:space="preserve">  adult$age,</w:t>
+              <w:br/>
+              <w:t xml:space="preserve">  breaks = seq(15, 95, by = 5),</w:t>
+              <w:br/>
+              <w:t xml:space="preserve">  col = "#4A90E2",</w:t>
+              <w:br/>
+              <w:t xml:space="preserve">  border = "#1B365D",</w:t>
+              <w:br/>
+              <w:t xml:space="preserve">  main = "Figure 15. Supplementary Base R Plot: Age Distribution Histogram",</w:t>
+              <w:br/>
+              <w:t xml:space="preserve">  xlab = "Age (Years)",</w:t>
+              <w:br/>
+              <w:t xml:space="preserve">  ylab = "Frequency (Count)",</w:t>
+              <w:br/>
+              <w:t xml:space="preserve">  cex.main = 1.25,</w:t>
+              <w:br/>
+              <w:t xml:space="preserve">  col.main = "#1B365D",</w:t>
+              <w:br/>
+              <w:t xml:space="preserve">  cex.lab = 1.05,</w:t>
+              <w:br/>
+              <w:t xml:space="preserve">  font.lab = 2,</w:t>
+              <w:br/>
+              <w:t xml:space="preserve">  las = 1,</w:t>
+              <w:br/>
+              <w:t xml:space="preserve">  ylim = c(0, 6500)</w:t>
+              <w:br/>
+              <w:t>)</w:t>
+              <w:br/>
+              <w:br/>
+              <w:t>grid(nx = NA, ny = NULL, col = "#E9ECEF", lty = 1, lwd = 1)</w:t>
+              <w:br/>
+              <w:t>plot(h, col = "#4A90E2", border = "#1B365D", add = TRUE)</w:t>
+              <w:br/>
+              <w:br/>
+              <w:t># Add median and mean vertical reference lines</w:t>
+              <w:br/>
+              <w:t>abline(v = median(adult$age), col = "#D9534F", lwd = 2.5, lty = 2)</w:t>
+              <w:br/>
+              <w:t>abline(v = mean(adult$age), col = "#F5A623", lwd = 2.5, lty = 1)</w:t>
+              <w:br/>
+              <w:br/>
+              <w:t>legend(</w:t>
+              <w:br/>
+              <w:t xml:space="preserve">  "topright",</w:t>
+              <w:br/>
+              <w:t xml:space="preserve">  legend = c(</w:t>
+              <w:br/>
+              <w:t xml:space="preserve">    sprintf("Median: %d years", as.integer(median(adult$age))),</w:t>
+              <w:br/>
+              <w:t xml:space="preserve">    sprintf("Mean: %.1f years", mean(adult$age)),</w:t>
+              <w:br/>
+              <w:t xml:space="preserve">    sprintf("N = %s", format(nrow(adult), big.mark = ","))</w:t>
+              <w:br/>
+              <w:t xml:space="preserve">  ),</w:t>
+              <w:br/>
+              <w:t xml:space="preserve">  col = c("#D9534F", "#F5A623", "transparent"),</w:t>
+              <w:br/>
+              <w:t xml:space="preserve">  lty = c(2, 1, 0),</w:t>
+              <w:br/>
+              <w:t xml:space="preserve">  lwd = c(2.5, 2.5, 0),</w:t>
+              <w:br/>
+              <w:t xml:space="preserve">  bty = "n",</w:t>
+              <w:br/>
+              <w:t xml:space="preserve">  cex = 0.95</w:t>
+              <w:br/>
+              <w:t>)</w:t>
+              <w:br/>
+              <w:br/>
+              <w:t>mtext(</w:t>
+              <w:br/>
+              <w:t xml:space="preserve">  "Base R graphics implementation demonstrating dependency-free distribution plotting (Skewness: 0.56)",</w:t>
+              <w:br/>
+              <w:t xml:space="preserve">  side = 3, line = 0.4, cex = 0.88, col = "#465C7A"</w:t>
+              <w:br/>
+              <w:t>)</w:t>
+              <w:br/>
+              <w:t>dev.off()</w:t>
+              <w:br/>
+              <w:br/>
+              <w:t>cat("\nAll 15 Week 2 visualizations (13 ggplot2 + 1 lattice + 1 base R) generated successfully!\n")</w:t>
               <w:br/>
               <w:t>cat("=== Script 08 Complete ===\n")</w:t>
             </w:r>

</xml_diff>